<commit_message>
fix: separate plate payment from printed documents
</commit_message>
<xml_diff>
--- a/templates/zaiavlenie.docx
+++ b/templates/zaiavlenie.docx
@@ -152,42 +152,7 @@
               </w:rPr>
             </w:pPr>
             <w:r>
-              <w:rPr>
-                <w:rFonts w:ascii="Arial" w:hAnsi="Arial"/>
-              </w:rPr>
-              <w:t>ПРОШУ</w:t>
-            </w:r>
-            <w:r>
-              <w:rPr>
-                <w:rFonts w:ascii="Arial" w:hAnsi="Arial"/>
-              </w:rPr>
-              <w:t xml:space="preserve"> </w:t>
-            </w:r>
-            <w:r>
-              <w:rPr>
-                <w:rFonts w:ascii="Arial" w:hAnsi="Arial"/>
-              </w:rPr>
-              <w:t xml:space="preserve">ЗАРЕГИСТРИРОВАТЬ </w:t>
-            </w:r>
-            <w:r>
-              <w:rPr>
-                <w:rFonts w:ascii="Arial" w:hAnsi="Arial"/>
-              </w:rPr>
-              <w:t xml:space="preserve">ИЗМЕНЕНИЕ СОБСТВЕННИКА ПО ДКП, </w:t>
-            </w:r>
-            <w:r>
-              <w:rPr>
-                <w:rFonts w:ascii="Arial" w:hAnsi="Arial"/>
-                <w:b/>
-                <w:bCs/>
-              </w:rPr>
-              <w:t>НЗ</w:t>
-            </w:r>
-            <w:r>
-              <w:rPr>
-                <w:rFonts w:ascii="Arial" w:hAnsi="Arial"/>
-              </w:rPr>
-              <w:t xml:space="preserve"> </w:t>
+              <w:t>ПРОШУ ЗАРЕГИСТРИРОВАТЬ ИЗМЕНЕНИЕ СОБСТВЕННИКА ПО ДКП, {{Действие}}</w:t>
             </w:r>
           </w:p>
         </w:tc>

</xml_diff>

<commit_message>
fix: clear dkp fields when seller disabled
</commit_message>
<xml_diff>
--- a/templates/zaiavlenie.docx
+++ b/templates/zaiavlenie.docx
@@ -1,6 +1,6 @@
 
 <file path=word/document.xml><?xml version="1.0" encoding="utf-8"?>
-<w:document xmlns:wpc="http://schemas.microsoft.com/office/word/2010/wordprocessingCanvas" xmlns:cx="http://schemas.microsoft.com/office/drawing/2014/chartex" xmlns:cx1="http://schemas.microsoft.com/office/drawing/2015/9/8/chartex" xmlns:cx2="http://schemas.microsoft.com/office/drawing/2015/10/21/chartex" xmlns:cx3="http://schemas.microsoft.com/office/drawing/2016/5/9/chartex" xmlns:cx4="http://schemas.microsoft.com/office/drawing/2016/5/10/chartex" xmlns:cx5="http://schemas.microsoft.com/office/drawing/2016/5/11/chartex" xmlns:cx6="http://schemas.microsoft.com/office/drawing/2016/5/12/chartex" xmlns:cx7="http://schemas.microsoft.com/office/drawing/2016/5/13/chartex" xmlns:cx8="http://schemas.microsoft.com/office/drawing/2016/5/14/chartex" xmlns:mc="http://schemas.openxmlformats.org/markup-compatibility/2006" xmlns:aink="http://schemas.microsoft.com/office/drawing/2016/ink" xmlns:am3d="http://schemas.microsoft.com/office/drawing/2017/model3d" xmlns:o="urn:schemas-microsoft-com:office:office" xmlns:r="http://schemas.openxmlformats.org/officeDocument/2006/relationships" xmlns:m="http://schemas.openxmlformats.org/officeDocument/2006/math" xmlns:v="urn:schemas-microsoft-com:vml" xmlns:wp14="http://schemas.microsoft.com/office/word/2010/wordprocessingDrawing" xmlns:wp="http://schemas.openxmlformats.org/drawingml/2006/wordprocessingDrawing" xmlns:w10="urn:schemas-microsoft-com:office:word" xmlns:w="http://schemas.openxmlformats.org/wordprocessingml/2006/main" xmlns:w14="http://schemas.microsoft.com/office/word/2010/wordml" xmlns:w15="http://schemas.microsoft.com/office/word/2012/wordml" xmlns:w16cex="http://schemas.microsoft.com/office/word/2018/wordml/cex" xmlns:w16cid="http://schemas.microsoft.com/office/word/2016/wordml/cid" xmlns:w16="http://schemas.microsoft.com/office/word/2018/wordml" xmlns:w16sdtdh="http://schemas.microsoft.com/office/word/2020/wordml/sdtdatahash" xmlns:w16se="http://schemas.microsoft.com/office/word/2015/wordml/symex" xmlns:wpg="http://schemas.microsoft.com/office/word/2010/wordprocessingGroup" xmlns:wpi="http://schemas.microsoft.com/office/word/2010/wordprocessingInk" xmlns:wne="http://schemas.microsoft.com/office/word/2006/wordml" xmlns:wps="http://schemas.microsoft.com/office/word/2010/wordprocessingShape" mc:Ignorable="w14 w15 w16se w16cid w16 w16cex w16sdtdh wp14">
+<w:document xmlns:wpc="http://schemas.microsoft.com/office/word/2010/wordprocessingCanvas" xmlns:cx="http://schemas.microsoft.com/office/drawing/2014/chartex" xmlns:cx1="http://schemas.microsoft.com/office/drawing/2015/9/8/chartex" xmlns:cx2="http://schemas.microsoft.com/office/drawing/2015/10/21/chartex" xmlns:cx3="http://schemas.microsoft.com/office/drawing/2016/5/9/chartex" xmlns:cx4="http://schemas.microsoft.com/office/drawing/2016/5/10/chartex" xmlns:cx5="http://schemas.microsoft.com/office/drawing/2016/5/11/chartex" xmlns:cx6="http://schemas.microsoft.com/office/drawing/2016/5/12/chartex" xmlns:cx7="http://schemas.microsoft.com/office/drawing/2016/5/13/chartex" xmlns:cx8="http://schemas.microsoft.com/office/drawing/2016/5/14/chartex" xmlns:mc="http://schemas.openxmlformats.org/markup-compatibility/2006" xmlns:aink="http://schemas.microsoft.com/office/drawing/2016/ink" xmlns:am3d="http://schemas.microsoft.com/office/drawing/2017/model3d" xmlns:o="urn:schemas-microsoft-com:office:office" xmlns:oel="http://schemas.microsoft.com/office/2019/extlst" xmlns:r="http://schemas.openxmlformats.org/officeDocument/2006/relationships" xmlns:m="http://schemas.openxmlformats.org/officeDocument/2006/math" xmlns:v="urn:schemas-microsoft-com:vml" xmlns:wp14="http://schemas.microsoft.com/office/word/2010/wordprocessingDrawing" xmlns:wp="http://schemas.openxmlformats.org/drawingml/2006/wordprocessingDrawing" xmlns:w10="urn:schemas-microsoft-com:office:word" xmlns:w="http://schemas.openxmlformats.org/wordprocessingml/2006/main" xmlns:w14="http://schemas.microsoft.com/office/word/2010/wordml" xmlns:w15="http://schemas.microsoft.com/office/word/2012/wordml" xmlns:w16cex="http://schemas.microsoft.com/office/word/2018/wordml/cex" xmlns:w16cid="http://schemas.microsoft.com/office/word/2016/wordml/cid" xmlns:w16="http://schemas.microsoft.com/office/word/2018/wordml" xmlns:w16du="http://schemas.microsoft.com/office/word/2023/wordml/word16du" xmlns:w16sdtdh="http://schemas.microsoft.com/office/word/2020/wordml/sdtdatahash" xmlns:w16sdtfl="http://schemas.microsoft.com/office/word/2024/wordml/sdtformatlock" xmlns:w16se="http://schemas.microsoft.com/office/word/2015/wordml/symex" xmlns:wpg="http://schemas.microsoft.com/office/word/2010/wordprocessingGroup" xmlns:wpi="http://schemas.microsoft.com/office/word/2010/wordprocessingInk" xmlns:wne="http://schemas.microsoft.com/office/word/2006/wordml" xmlns:wps="http://schemas.microsoft.com/office/word/2010/wordprocessingShape" mc:Ignorable="w14 w15 w16se w16cid w16 w16cex w16sdtdh w16sdtfl w16du wp14">
   <w:body>
     <w:tbl>
       <w:tblPr>
@@ -83,7 +83,19 @@
               <w:rPr>
                 <w:rFonts w:ascii="Arial" w:hAnsi="Arial"/>
               </w:rPr>
-              <w:t xml:space="preserve">Заявление №                           в РЭО ГИБДД ОМВД России по г. Михайловке  </w:t>
+              <w:t xml:space="preserve">Заявление №                           в </w:t>
+            </w:r>
+            <w:r>
+              <w:rPr>
+                <w:rFonts w:ascii="Arial" w:hAnsi="Arial"/>
+              </w:rPr>
+              <w:t>1 отделение 4 МРЭО госавтоинспекции ГУ МВД России по Волгоградской области</w:t>
+            </w:r>
+            <w:r>
+              <w:rPr>
+                <w:rFonts w:ascii="Arial" w:hAnsi="Arial"/>
+              </w:rPr>
+              <w:t xml:space="preserve"> </w:t>
             </w:r>
           </w:p>
           <w:p>
@@ -640,6 +652,9 @@
             <w:r>
               <w:t xml:space="preserve">{{Паспорт}} </w:t>
             </w:r>
+            <w:r>
+              <w:t>{{ОГРН}}</w:t>
+            </w:r>
           </w:p>
         </w:tc>
         <w:tc>
@@ -679,7 +694,7 @@
               <w:pStyle w:val="ac"/>
             </w:pPr>
             <w:r>
-              <w:t>{{ИНН}}</w:t>
+              <w:t>ИНН</w:t>
             </w:r>
           </w:p>
         </w:tc>
@@ -698,6 +713,9 @@
             <w:pPr>
               <w:pStyle w:val="ad"/>
             </w:pPr>
+            <w:r>
+              <w:t>{{ИНН}}</w:t>
+            </w:r>
           </w:p>
         </w:tc>
         <w:tc>
@@ -1164,59 +1182,54 @@
         </w:tc>
       </w:tr>
       <w:tr>
-        <w:tc>
-          <w:tcPr>
-            <w:tcW w:type="dxa" w:w="1565"/>
-          </w:tcPr>
-          <w:p>
-            <w:r>
-              <w:t>ОГРН</w:t>
-            </w:r>
-          </w:p>
-        </w:tc>
-        <w:tc>
-          <w:tcPr>
-            <w:tcW w:type="dxa" w:w="834"/>
-          </w:tcPr>
-          <w:p>
-            <w:r>
-              <w:t>{{ОГРН}}</w:t>
-            </w:r>
-          </w:p>
-        </w:tc>
-        <w:tc>
-          <w:tcPr>
-            <w:tcW w:type="dxa" w:w="895"/>
+        <w:trPr>
+          <w:trHeight w:val="178"/>
+        </w:trPr>
+        <w:tc>
+          <w:tcPr>
+            <w:tcW w:w="1565" w:type="dxa"/>
           </w:tcPr>
           <w:p/>
         </w:tc>
         <w:tc>
           <w:tcPr>
-            <w:tcW w:type="dxa" w:w="645"/>
+            <w:tcW w:w="834" w:type="dxa"/>
           </w:tcPr>
           <w:p/>
         </w:tc>
         <w:tc>
           <w:tcPr>
-            <w:tcW w:type="dxa" w:w="177"/>
+            <w:tcW w:w="895" w:type="dxa"/>
           </w:tcPr>
           <w:p/>
         </w:tc>
         <w:tc>
           <w:tcPr>
-            <w:tcW w:type="dxa" w:w="2693"/>
+            <w:tcW w:w="645" w:type="dxa"/>
           </w:tcPr>
           <w:p/>
         </w:tc>
         <w:tc>
           <w:tcPr>
-            <w:tcW w:type="dxa" w:w="3613"/>
+            <w:tcW w:w="177" w:type="dxa"/>
           </w:tcPr>
           <w:p/>
         </w:tc>
         <w:tc>
           <w:tcPr>
-            <w:tcW w:type="dxa" w:w="493"/>
+            <w:tcW w:w="2693" w:type="dxa"/>
+          </w:tcPr>
+          <w:p/>
+        </w:tc>
+        <w:tc>
+          <w:tcPr>
+            <w:tcW w:w="3613" w:type="dxa"/>
+          </w:tcPr>
+          <w:p/>
+        </w:tc>
+        <w:tc>
+          <w:tcPr>
+            <w:tcW w:w="493" w:type="dxa"/>
           </w:tcPr>
           <w:p/>
         </w:tc>
@@ -3630,7 +3643,7 @@
 </file>
 
 <file path=word/numbering.xml><?xml version="1.0" encoding="utf-8"?>
-<w:numbering xmlns:wpc="http://schemas.microsoft.com/office/word/2010/wordprocessingCanvas" xmlns:cx="http://schemas.microsoft.com/office/drawing/2014/chartex" xmlns:cx1="http://schemas.microsoft.com/office/drawing/2015/9/8/chartex" xmlns:cx2="http://schemas.microsoft.com/office/drawing/2015/10/21/chartex" xmlns:cx3="http://schemas.microsoft.com/office/drawing/2016/5/9/chartex" xmlns:cx4="http://schemas.microsoft.com/office/drawing/2016/5/10/chartex" xmlns:cx5="http://schemas.microsoft.com/office/drawing/2016/5/11/chartex" xmlns:cx6="http://schemas.microsoft.com/office/drawing/2016/5/12/chartex" xmlns:cx7="http://schemas.microsoft.com/office/drawing/2016/5/13/chartex" xmlns:cx8="http://schemas.microsoft.com/office/drawing/2016/5/14/chartex" xmlns:mc="http://schemas.openxmlformats.org/markup-compatibility/2006" xmlns:aink="http://schemas.microsoft.com/office/drawing/2016/ink" xmlns:am3d="http://schemas.microsoft.com/office/drawing/2017/model3d" xmlns:o="urn:schemas-microsoft-com:office:office" xmlns:r="http://schemas.openxmlformats.org/officeDocument/2006/relationships" xmlns:m="http://schemas.openxmlformats.org/officeDocument/2006/math" xmlns:v="urn:schemas-microsoft-com:vml" xmlns:wp14="http://schemas.microsoft.com/office/word/2010/wordprocessingDrawing" xmlns:wp="http://schemas.openxmlformats.org/drawingml/2006/wordprocessingDrawing" xmlns:w10="urn:schemas-microsoft-com:office:word" xmlns:w="http://schemas.openxmlformats.org/wordprocessingml/2006/main" xmlns:w14="http://schemas.microsoft.com/office/word/2010/wordml" xmlns:w15="http://schemas.microsoft.com/office/word/2012/wordml" xmlns:w16cex="http://schemas.microsoft.com/office/word/2018/wordml/cex" xmlns:w16cid="http://schemas.microsoft.com/office/word/2016/wordml/cid" xmlns:w16="http://schemas.microsoft.com/office/word/2018/wordml" xmlns:w16sdtdh="http://schemas.microsoft.com/office/word/2020/wordml/sdtdatahash" xmlns:w16se="http://schemas.microsoft.com/office/word/2015/wordml/symex" xmlns:wpg="http://schemas.microsoft.com/office/word/2010/wordprocessingGroup" xmlns:wpi="http://schemas.microsoft.com/office/word/2010/wordprocessingInk" xmlns:wne="http://schemas.microsoft.com/office/word/2006/wordml" xmlns:wps="http://schemas.microsoft.com/office/word/2010/wordprocessingShape" mc:Ignorable="w14 w15 w16se w16cid w16 w16cex w16sdtdh wp14">
+<w:numbering xmlns:wpc="http://schemas.microsoft.com/office/word/2010/wordprocessingCanvas" xmlns:cx="http://schemas.microsoft.com/office/drawing/2014/chartex" xmlns:cx1="http://schemas.microsoft.com/office/drawing/2015/9/8/chartex" xmlns:cx2="http://schemas.microsoft.com/office/drawing/2015/10/21/chartex" xmlns:cx3="http://schemas.microsoft.com/office/drawing/2016/5/9/chartex" xmlns:cx4="http://schemas.microsoft.com/office/drawing/2016/5/10/chartex" xmlns:cx5="http://schemas.microsoft.com/office/drawing/2016/5/11/chartex" xmlns:cx6="http://schemas.microsoft.com/office/drawing/2016/5/12/chartex" xmlns:cx7="http://schemas.microsoft.com/office/drawing/2016/5/13/chartex" xmlns:cx8="http://schemas.microsoft.com/office/drawing/2016/5/14/chartex" xmlns:mc="http://schemas.openxmlformats.org/markup-compatibility/2006" xmlns:aink="http://schemas.microsoft.com/office/drawing/2016/ink" xmlns:am3d="http://schemas.microsoft.com/office/drawing/2017/model3d" xmlns:o="urn:schemas-microsoft-com:office:office" xmlns:oel="http://schemas.microsoft.com/office/2019/extlst" xmlns:r="http://schemas.openxmlformats.org/officeDocument/2006/relationships" xmlns:m="http://schemas.openxmlformats.org/officeDocument/2006/math" xmlns:v="urn:schemas-microsoft-com:vml" xmlns:wp14="http://schemas.microsoft.com/office/word/2010/wordprocessingDrawing" xmlns:wp="http://schemas.openxmlformats.org/drawingml/2006/wordprocessingDrawing" xmlns:w10="urn:schemas-microsoft-com:office:word" xmlns:w="http://schemas.openxmlformats.org/wordprocessingml/2006/main" xmlns:w14="http://schemas.microsoft.com/office/word/2010/wordml" xmlns:w15="http://schemas.microsoft.com/office/word/2012/wordml" xmlns:w16cex="http://schemas.microsoft.com/office/word/2018/wordml/cex" xmlns:w16cid="http://schemas.microsoft.com/office/word/2016/wordml/cid" xmlns:w16="http://schemas.microsoft.com/office/word/2018/wordml" xmlns:w16du="http://schemas.microsoft.com/office/word/2023/wordml/word16du" xmlns:w16sdtdh="http://schemas.microsoft.com/office/word/2020/wordml/sdtdatahash" xmlns:w16sdtfl="http://schemas.microsoft.com/office/word/2024/wordml/sdtformatlock" xmlns:w16se="http://schemas.microsoft.com/office/word/2015/wordml/symex" xmlns:wpg="http://schemas.microsoft.com/office/word/2010/wordprocessingGroup" xmlns:wpi="http://schemas.microsoft.com/office/word/2010/wordprocessingInk" xmlns:wne="http://schemas.microsoft.com/office/word/2006/wordml" xmlns:wps="http://schemas.microsoft.com/office/word/2010/wordprocessingShape" mc:Ignorable="w14 w15 w16se w16cid w16 w16cex w16sdtdh w16sdtfl w16du wp14">
   <w:abstractNum w:abstractNumId="0" w15:restartNumberingAfterBreak="0">
     <w:nsid w:val="146B00C8"/>
     <w:multiLevelType w:val="multilevel"/>
@@ -5543,89 +5556,89 @@
       <w:lvlJc w:val="left"/>
     </w:lvl>
   </w:abstractNum>
-  <w:num w:numId="1">
+  <w:num w:numId="1" w16cid:durableId="1438136323">
     <w:abstractNumId w:val="3"/>
   </w:num>
-  <w:num w:numId="2">
+  <w:num w:numId="2" w16cid:durableId="255748903">
     <w:abstractNumId w:val="5"/>
   </w:num>
-  <w:num w:numId="3">
+  <w:num w:numId="3" w16cid:durableId="1173305364">
     <w:abstractNumId w:val="9"/>
   </w:num>
-  <w:num w:numId="4">
+  <w:num w:numId="4" w16cid:durableId="298388171">
     <w:abstractNumId w:val="1"/>
   </w:num>
-  <w:num w:numId="5">
+  <w:num w:numId="5" w16cid:durableId="701133789">
     <w:abstractNumId w:val="25"/>
   </w:num>
-  <w:num w:numId="6">
+  <w:num w:numId="6" w16cid:durableId="163709396">
     <w:abstractNumId w:val="19"/>
   </w:num>
-  <w:num w:numId="7">
+  <w:num w:numId="7" w16cid:durableId="720134870">
     <w:abstractNumId w:val="13"/>
   </w:num>
-  <w:num w:numId="8">
+  <w:num w:numId="8" w16cid:durableId="1464301941">
     <w:abstractNumId w:val="15"/>
   </w:num>
-  <w:num w:numId="9">
+  <w:num w:numId="9" w16cid:durableId="1271083217">
     <w:abstractNumId w:val="6"/>
   </w:num>
-  <w:num w:numId="10">
+  <w:num w:numId="10" w16cid:durableId="1114323610">
     <w:abstractNumId w:val="12"/>
   </w:num>
-  <w:num w:numId="11">
+  <w:num w:numId="11" w16cid:durableId="1186560469">
     <w:abstractNumId w:val="23"/>
   </w:num>
-  <w:num w:numId="12">
+  <w:num w:numId="12" w16cid:durableId="546572714">
     <w:abstractNumId w:val="10"/>
   </w:num>
-  <w:num w:numId="13">
+  <w:num w:numId="13" w16cid:durableId="1811284167">
     <w:abstractNumId w:val="11"/>
   </w:num>
-  <w:num w:numId="14">
+  <w:num w:numId="14" w16cid:durableId="122113558">
     <w:abstractNumId w:val="22"/>
   </w:num>
-  <w:num w:numId="15">
+  <w:num w:numId="15" w16cid:durableId="250044282">
     <w:abstractNumId w:val="20"/>
   </w:num>
-  <w:num w:numId="16">
+  <w:num w:numId="16" w16cid:durableId="1283807222">
     <w:abstractNumId w:val="4"/>
   </w:num>
-  <w:num w:numId="17">
+  <w:num w:numId="17" w16cid:durableId="1323464941">
     <w:abstractNumId w:val="18"/>
   </w:num>
-  <w:num w:numId="18">
+  <w:num w:numId="18" w16cid:durableId="430662210">
     <w:abstractNumId w:val="7"/>
   </w:num>
-  <w:num w:numId="19">
+  <w:num w:numId="19" w16cid:durableId="640572880">
     <w:abstractNumId w:val="24"/>
   </w:num>
-  <w:num w:numId="20">
+  <w:num w:numId="20" w16cid:durableId="1941137906">
     <w:abstractNumId w:val="0"/>
   </w:num>
-  <w:num w:numId="21">
+  <w:num w:numId="21" w16cid:durableId="384642799">
     <w:abstractNumId w:val="2"/>
   </w:num>
-  <w:num w:numId="22">
+  <w:num w:numId="22" w16cid:durableId="883640988">
     <w:abstractNumId w:val="14"/>
   </w:num>
-  <w:num w:numId="23">
+  <w:num w:numId="23" w16cid:durableId="518859529">
     <w:abstractNumId w:val="8"/>
   </w:num>
-  <w:num w:numId="24">
+  <w:num w:numId="24" w16cid:durableId="591619863">
     <w:abstractNumId w:val="21"/>
   </w:num>
-  <w:num w:numId="25">
+  <w:num w:numId="25" w16cid:durableId="872036277">
     <w:abstractNumId w:val="17"/>
   </w:num>
-  <w:num w:numId="26">
+  <w:num w:numId="26" w16cid:durableId="1169295108">
     <w:abstractNumId w:val="16"/>
   </w:num>
 </w:numbering>
 </file>
 
 <file path=word/styles.xml><?xml version="1.0" encoding="utf-8"?>
-<w:styles xmlns:mc="http://schemas.openxmlformats.org/markup-compatibility/2006" xmlns:r="http://schemas.openxmlformats.org/officeDocument/2006/relationships" xmlns:w="http://schemas.openxmlformats.org/wordprocessingml/2006/main" xmlns:w14="http://schemas.microsoft.com/office/word/2010/wordml" xmlns:w15="http://schemas.microsoft.com/office/word/2012/wordml" xmlns:w16cex="http://schemas.microsoft.com/office/word/2018/wordml/cex" xmlns:w16cid="http://schemas.microsoft.com/office/word/2016/wordml/cid" xmlns:w16="http://schemas.microsoft.com/office/word/2018/wordml" xmlns:w16sdtdh="http://schemas.microsoft.com/office/word/2020/wordml/sdtdatahash" xmlns:w16se="http://schemas.microsoft.com/office/word/2015/wordml/symex" mc:Ignorable="w14 w15 w16se w16cid w16 w16cex w16sdtdh">
+<w:styles xmlns:mc="http://schemas.openxmlformats.org/markup-compatibility/2006" xmlns:r="http://schemas.openxmlformats.org/officeDocument/2006/relationships" xmlns:w="http://schemas.openxmlformats.org/wordprocessingml/2006/main" xmlns:w14="http://schemas.microsoft.com/office/word/2010/wordml" xmlns:w15="http://schemas.microsoft.com/office/word/2012/wordml" xmlns:w16cex="http://schemas.microsoft.com/office/word/2018/wordml/cex" xmlns:w16cid="http://schemas.microsoft.com/office/word/2016/wordml/cid" xmlns:w16="http://schemas.microsoft.com/office/word/2018/wordml" xmlns:w16du="http://schemas.microsoft.com/office/word/2023/wordml/word16du" xmlns:w16sdtdh="http://schemas.microsoft.com/office/word/2020/wordml/sdtdatahash" xmlns:w16sdtfl="http://schemas.microsoft.com/office/word/2024/wordml/sdtformatlock" xmlns:w16se="http://schemas.microsoft.com/office/word/2015/wordml/symex" mc:Ignorable="w14 w15 w16se w16cid w16 w16cex w16sdtdh w16sdtfl w16du">
   <w:docDefaults>
     <w:rPrDefault>
       <w:rPr>

</xml_diff>